<commit_message>
plansza i wpisywanie x oraz y (opisane na word)
</commit_message>
<xml_diff>
--- a/dokumentacja.docx
+++ b/dokumentacja.docx
@@ -10,6 +10,353 @@
     <w:p>
       <w:r>
         <w:t>Cel: Moja gra to będzie to</w:t>
+      </w:r>
+      <w:r>
+        <w:t xml:space="preserve"> Snake(możliwe ze będzie zmiana).  Zamierzam </w:t>
+      </w:r>
+      <w:proofErr w:type="spellStart"/>
+      <w:r>
+        <w:t>zrobic</w:t>
+      </w:r>
+      <w:proofErr w:type="spellEnd"/>
+      <w:r>
+        <w:t>:</w:t>
+      </w:r>
+    </w:p>
+    <w:p>
+      <w:pPr>
+        <w:pStyle w:val="Akapitzlist"/>
+        <w:numPr>
+          <w:ilvl w:val="0"/>
+          <w:numId w:val="2"/>
+        </w:numPr>
+      </w:pPr>
+      <w:r>
+        <w:t>Gra jednoosobowa</w:t>
+      </w:r>
+    </w:p>
+    <w:p>
+      <w:pPr>
+        <w:pStyle w:val="Akapitzlist"/>
+        <w:numPr>
+          <w:ilvl w:val="0"/>
+          <w:numId w:val="2"/>
+        </w:numPr>
+      </w:pPr>
+      <w:r>
+        <w:t>Widoczny licznik punktów</w:t>
+      </w:r>
+    </w:p>
+    <w:p>
+      <w:pPr>
+        <w:pStyle w:val="Akapitzlist"/>
+        <w:numPr>
+          <w:ilvl w:val="0"/>
+          <w:numId w:val="2"/>
+        </w:numPr>
+      </w:pPr>
+      <w:proofErr w:type="spellStart"/>
+      <w:r>
+        <w:t>Zakonczenie</w:t>
+      </w:r>
+      <w:proofErr w:type="spellEnd"/>
+      <w:r>
+        <w:t xml:space="preserve"> gry (wygrana/przegrana)</w:t>
+      </w:r>
+    </w:p>
+    <w:p>
+      <w:pPr>
+        <w:pStyle w:val="Akapitzlist"/>
+        <w:numPr>
+          <w:ilvl w:val="0"/>
+          <w:numId w:val="2"/>
+        </w:numPr>
+      </w:pPr>
+      <w:r>
+        <w:t>Zmiana kierunków strzałkami</w:t>
+      </w:r>
+    </w:p>
+    <w:p>
+      <w:pPr>
+        <w:pStyle w:val="Akapitzlist"/>
+        <w:numPr>
+          <w:ilvl w:val="0"/>
+          <w:numId w:val="2"/>
+        </w:numPr>
+      </w:pPr>
+      <w:proofErr w:type="spellStart"/>
+      <w:r>
+        <w:t>Mozliwosc</w:t>
+      </w:r>
+      <w:proofErr w:type="spellEnd"/>
+      <w:r>
+        <w:t xml:space="preserve"> zbierania jabłek(</w:t>
+      </w:r>
+      <w:proofErr w:type="spellStart"/>
+      <w:r>
+        <w:t>punktow</w:t>
+      </w:r>
+      <w:proofErr w:type="spellEnd"/>
+      <w:r>
+        <w:t>)</w:t>
+      </w:r>
+    </w:p>
+    <w:p>
+      <w:pPr>
+        <w:ind w:left="360"/>
+      </w:pPr>
+    </w:p>
+    <w:p>
+      <w:pPr>
+        <w:ind w:left="360"/>
+      </w:pPr>
+      <w:r>
+        <w:t xml:space="preserve">03 czerwca zmiana </w:t>
+      </w:r>
+      <w:proofErr w:type="spellStart"/>
+      <w:r>
+        <w:t>pomyslu</w:t>
+      </w:r>
+      <w:proofErr w:type="spellEnd"/>
+    </w:p>
+    <w:p>
+      <w:pPr>
+        <w:ind w:left="360"/>
+      </w:pPr>
+      <w:r>
+        <w:t xml:space="preserve">Cel: Moja gra to będą statki Zamierzam </w:t>
+      </w:r>
+      <w:proofErr w:type="spellStart"/>
+      <w:r>
+        <w:t>zrobic</w:t>
+      </w:r>
+      <w:proofErr w:type="spellEnd"/>
+      <w:r>
+        <w:t>:</w:t>
+      </w:r>
+    </w:p>
+    <w:p>
+      <w:pPr>
+        <w:pStyle w:val="Akapitzlist"/>
+        <w:numPr>
+          <w:ilvl w:val="0"/>
+          <w:numId w:val="3"/>
+        </w:numPr>
+      </w:pPr>
+      <w:r>
+        <w:t>Gra jednoosobowa</w:t>
+      </w:r>
+    </w:p>
+    <w:p>
+      <w:pPr>
+        <w:pStyle w:val="Akapitzlist"/>
+        <w:numPr>
+          <w:ilvl w:val="0"/>
+          <w:numId w:val="3"/>
+        </w:numPr>
+      </w:pPr>
+      <w:r>
+        <w:t xml:space="preserve">Widoczny licznik </w:t>
+      </w:r>
+      <w:proofErr w:type="spellStart"/>
+      <w:r>
+        <w:t>puntkow</w:t>
+      </w:r>
+      <w:proofErr w:type="spellEnd"/>
+      <w:r>
+        <w:t xml:space="preserve"> (trafień)</w:t>
+      </w:r>
+    </w:p>
+    <w:p>
+      <w:pPr>
+        <w:pStyle w:val="Akapitzlist"/>
+        <w:numPr>
+          <w:ilvl w:val="0"/>
+          <w:numId w:val="3"/>
+        </w:numPr>
+      </w:pPr>
+      <w:proofErr w:type="spellStart"/>
+      <w:r>
+        <w:t>Zakonczenie</w:t>
+      </w:r>
+      <w:proofErr w:type="spellEnd"/>
+      <w:r>
+        <w:t xml:space="preserve"> gry (pokaz </w:t>
+      </w:r>
+      <w:proofErr w:type="spellStart"/>
+      <w:r>
+        <w:t>punktow</w:t>
+      </w:r>
+      <w:proofErr w:type="spellEnd"/>
+      <w:r>
+        <w:t>)</w:t>
+      </w:r>
+    </w:p>
+    <w:p>
+      <w:pPr>
+        <w:pStyle w:val="Akapitzlist"/>
+        <w:numPr>
+          <w:ilvl w:val="0"/>
+          <w:numId w:val="3"/>
+        </w:numPr>
+      </w:pPr>
+      <w:r>
+        <w:t>Za nie trafienie -1 punkt</w:t>
+      </w:r>
+    </w:p>
+    <w:p>
+      <w:pPr>
+        <w:pStyle w:val="Akapitzlist"/>
+        <w:numPr>
+          <w:ilvl w:val="0"/>
+          <w:numId w:val="3"/>
+        </w:numPr>
+      </w:pPr>
+      <w:r>
+        <w:t xml:space="preserve">Wpisywanie współrzędnych w które chcemy </w:t>
+      </w:r>
+      <w:proofErr w:type="spellStart"/>
+      <w:r>
+        <w:t>strzelic</w:t>
+      </w:r>
+      <w:proofErr w:type="spellEnd"/>
+    </w:p>
+    <w:p>
+      <w:pPr>
+        <w:pStyle w:val="Akapitzlist"/>
+      </w:pPr>
+    </w:p>
+    <w:p>
+      <w:pPr>
+        <w:pStyle w:val="Akapitzlist"/>
+      </w:pPr>
+      <w:r>
+        <w:t xml:space="preserve">Na lekcji: spytałem Chata </w:t>
+      </w:r>
+      <w:proofErr w:type="spellStart"/>
+      <w:r>
+        <w:t>gpt</w:t>
+      </w:r>
+      <w:proofErr w:type="spellEnd"/>
+      <w:r>
+        <w:t xml:space="preserve"> jak </w:t>
+      </w:r>
+      <w:proofErr w:type="spellStart"/>
+      <w:r>
+        <w:t>zrobic</w:t>
+      </w:r>
+      <w:proofErr w:type="spellEnd"/>
+      <w:r>
+        <w:t xml:space="preserve"> aby losowe miejsca statku </w:t>
+      </w:r>
+      <w:proofErr w:type="spellStart"/>
+      <w:r>
+        <w:t>wybuchaly</w:t>
+      </w:r>
+      <w:proofErr w:type="spellEnd"/>
+      <w:r>
+        <w:t xml:space="preserve">, jak wpisze się takie same współrzędne oraz żeby na miejsce trafionego statku </w:t>
+      </w:r>
+      <w:proofErr w:type="spellStart"/>
+      <w:r>
+        <w:t>pokazywal</w:t>
+      </w:r>
+      <w:proofErr w:type="spellEnd"/>
+      <w:r>
+        <w:t xml:space="preserve"> się „S” jako statek.</w:t>
+      </w:r>
+    </w:p>
+    <w:p>
+      <w:pPr>
+        <w:pStyle w:val="Akapitzlist"/>
+      </w:pPr>
+      <w:r>
+        <w:t xml:space="preserve">Sam zacząłem </w:t>
+      </w:r>
+      <w:proofErr w:type="spellStart"/>
+      <w:r>
+        <w:t>robic</w:t>
+      </w:r>
+      <w:proofErr w:type="spellEnd"/>
+      <w:r>
+        <w:t xml:space="preserve">   to, żeby </w:t>
+      </w:r>
+      <w:proofErr w:type="spellStart"/>
+      <w:r>
+        <w:t>wpisac</w:t>
+      </w:r>
+      <w:proofErr w:type="spellEnd"/>
+      <w:r>
+        <w:t xml:space="preserve"> </w:t>
+      </w:r>
+      <w:proofErr w:type="spellStart"/>
+      <w:r>
+        <w:t>kolumne</w:t>
+      </w:r>
+      <w:proofErr w:type="spellEnd"/>
+      <w:r>
+        <w:t xml:space="preserve"> i wiersz żeby </w:t>
+      </w:r>
+      <w:proofErr w:type="spellStart"/>
+      <w:r>
+        <w:t>sprawdzic</w:t>
+      </w:r>
+      <w:proofErr w:type="spellEnd"/>
+      <w:r>
+        <w:t xml:space="preserve"> czy </w:t>
+      </w:r>
+      <w:proofErr w:type="spellStart"/>
+      <w:r>
+        <w:t>trafilo</w:t>
+      </w:r>
+      <w:proofErr w:type="spellEnd"/>
+      <w:r>
+        <w:t xml:space="preserve"> się w statek.</w:t>
+      </w:r>
+    </w:p>
+    <w:p>
+      <w:pPr>
+        <w:pStyle w:val="Akapitzlist"/>
+      </w:pPr>
+    </w:p>
+    <w:p>
+      <w:pPr>
+        <w:pStyle w:val="Akapitzlist"/>
+      </w:pPr>
+      <w:r>
+        <w:t xml:space="preserve">Dzisiaj zrobiłem plansze, </w:t>
+      </w:r>
+      <w:proofErr w:type="spellStart"/>
+      <w:r>
+        <w:t>randomowe</w:t>
+      </w:r>
+      <w:proofErr w:type="spellEnd"/>
+      <w:r>
+        <w:t xml:space="preserve"> współrzędne </w:t>
+      </w:r>
+      <w:proofErr w:type="spellStart"/>
+      <w:r>
+        <w:t>statkow</w:t>
+      </w:r>
+      <w:proofErr w:type="spellEnd"/>
+      <w:r>
+        <w:t xml:space="preserve">, i zacząłem prace nad zmiana z wody („~”) na </w:t>
+      </w:r>
+      <w:proofErr w:type="spellStart"/>
+      <w:r>
+        <w:t>strzal</w:t>
+      </w:r>
+      <w:proofErr w:type="spellEnd"/>
+      <w:r>
+        <w:t xml:space="preserve">(„S”) jeśli wykonamy </w:t>
+      </w:r>
+      <w:proofErr w:type="spellStart"/>
+      <w:r>
+        <w:t>strzal</w:t>
+      </w:r>
+      <w:proofErr w:type="spellEnd"/>
+      <w:r>
+        <w:t xml:space="preserve"> nie trafiony, oraz trafiony („T”) jeśli trafimy w część statku.</w:t>
       </w:r>
     </w:p>
     <w:sectPr>
@@ -20,6 +367,287 @@
     </w:sectPr>
   </w:body>
 </w:document>
+</file>
+
+<file path=word/numbering.xml><?xml version="1.0" encoding="utf-8"?>
+<w:numbering xmlns:ve="http://schemas.openxmlformats.org/markup-compatibility/2006" xmlns:o="urn:schemas-microsoft-com:office:office" xmlns:r="http://schemas.openxmlformats.org/officeDocument/2006/relationships" xmlns:m="http://schemas.openxmlformats.org/officeDocument/2006/math" xmlns:v="urn:schemas-microsoft-com:vml" xmlns:wp="http://schemas.openxmlformats.org/drawingml/2006/wordprocessingDrawing" xmlns:w10="urn:schemas-microsoft-com:office:word" xmlns:w="http://schemas.openxmlformats.org/wordprocessingml/2006/main" xmlns:wne="http://schemas.microsoft.com/office/word/2006/wordml">
+  <w:abstractNum w:abstractNumId="0">
+    <w:nsid w:val="57B340B7"/>
+    <w:multiLevelType w:val="hybridMultilevel"/>
+    <w:tmpl w:val="155A8536"/>
+    <w:lvl w:ilvl="0" w:tplc="0415000F">
+      <w:start w:val="1"/>
+      <w:numFmt w:val="decimal"/>
+      <w:lvlText w:val="%1."/>
+      <w:lvlJc w:val="left"/>
+      <w:pPr>
+        <w:ind w:left="720" w:hanging="360"/>
+      </w:pPr>
+      <w:rPr>
+        <w:rFonts w:hint="default"/>
+      </w:rPr>
+    </w:lvl>
+    <w:lvl w:ilvl="1" w:tplc="04150019" w:tentative="1">
+      <w:start w:val="1"/>
+      <w:numFmt w:val="lowerLetter"/>
+      <w:lvlText w:val="%2."/>
+      <w:lvlJc w:val="left"/>
+      <w:pPr>
+        <w:ind w:left="1440" w:hanging="360"/>
+      </w:pPr>
+    </w:lvl>
+    <w:lvl w:ilvl="2" w:tplc="0415001B" w:tentative="1">
+      <w:start w:val="1"/>
+      <w:numFmt w:val="lowerRoman"/>
+      <w:lvlText w:val="%3."/>
+      <w:lvlJc w:val="right"/>
+      <w:pPr>
+        <w:ind w:left="2160" w:hanging="180"/>
+      </w:pPr>
+    </w:lvl>
+    <w:lvl w:ilvl="3" w:tplc="0415000F" w:tentative="1">
+      <w:start w:val="1"/>
+      <w:numFmt w:val="decimal"/>
+      <w:lvlText w:val="%4."/>
+      <w:lvlJc w:val="left"/>
+      <w:pPr>
+        <w:ind w:left="2880" w:hanging="360"/>
+      </w:pPr>
+    </w:lvl>
+    <w:lvl w:ilvl="4" w:tplc="04150019" w:tentative="1">
+      <w:start w:val="1"/>
+      <w:numFmt w:val="lowerLetter"/>
+      <w:lvlText w:val="%5."/>
+      <w:lvlJc w:val="left"/>
+      <w:pPr>
+        <w:ind w:left="3600" w:hanging="360"/>
+      </w:pPr>
+    </w:lvl>
+    <w:lvl w:ilvl="5" w:tplc="0415001B" w:tentative="1">
+      <w:start w:val="1"/>
+      <w:numFmt w:val="lowerRoman"/>
+      <w:lvlText w:val="%6."/>
+      <w:lvlJc w:val="right"/>
+      <w:pPr>
+        <w:ind w:left="4320" w:hanging="180"/>
+      </w:pPr>
+    </w:lvl>
+    <w:lvl w:ilvl="6" w:tplc="0415000F" w:tentative="1">
+      <w:start w:val="1"/>
+      <w:numFmt w:val="decimal"/>
+      <w:lvlText w:val="%7."/>
+      <w:lvlJc w:val="left"/>
+      <w:pPr>
+        <w:ind w:left="5040" w:hanging="360"/>
+      </w:pPr>
+    </w:lvl>
+    <w:lvl w:ilvl="7" w:tplc="04150019" w:tentative="1">
+      <w:start w:val="1"/>
+      <w:numFmt w:val="lowerLetter"/>
+      <w:lvlText w:val="%8."/>
+      <w:lvlJc w:val="left"/>
+      <w:pPr>
+        <w:ind w:left="5760" w:hanging="360"/>
+      </w:pPr>
+    </w:lvl>
+    <w:lvl w:ilvl="8" w:tplc="0415001B" w:tentative="1">
+      <w:start w:val="1"/>
+      <w:numFmt w:val="lowerRoman"/>
+      <w:lvlText w:val="%9."/>
+      <w:lvlJc w:val="right"/>
+      <w:pPr>
+        <w:ind w:left="6480" w:hanging="180"/>
+      </w:pPr>
+    </w:lvl>
+  </w:abstractNum>
+  <w:abstractNum w:abstractNumId="1">
+    <w:nsid w:val="6D7E4E54"/>
+    <w:multiLevelType w:val="hybridMultilevel"/>
+    <w:tmpl w:val="0C6E546E"/>
+    <w:lvl w:ilvl="0" w:tplc="0415000F">
+      <w:start w:val="1"/>
+      <w:numFmt w:val="decimal"/>
+      <w:lvlText w:val="%1."/>
+      <w:lvlJc w:val="left"/>
+      <w:pPr>
+        <w:ind w:left="720" w:hanging="360"/>
+      </w:pPr>
+      <w:rPr>
+        <w:rFonts w:hint="default"/>
+      </w:rPr>
+    </w:lvl>
+    <w:lvl w:ilvl="1" w:tplc="04150019" w:tentative="1">
+      <w:start w:val="1"/>
+      <w:numFmt w:val="lowerLetter"/>
+      <w:lvlText w:val="%2."/>
+      <w:lvlJc w:val="left"/>
+      <w:pPr>
+        <w:ind w:left="1440" w:hanging="360"/>
+      </w:pPr>
+    </w:lvl>
+    <w:lvl w:ilvl="2" w:tplc="0415001B" w:tentative="1">
+      <w:start w:val="1"/>
+      <w:numFmt w:val="lowerRoman"/>
+      <w:lvlText w:val="%3."/>
+      <w:lvlJc w:val="right"/>
+      <w:pPr>
+        <w:ind w:left="2160" w:hanging="180"/>
+      </w:pPr>
+    </w:lvl>
+    <w:lvl w:ilvl="3" w:tplc="0415000F" w:tentative="1">
+      <w:start w:val="1"/>
+      <w:numFmt w:val="decimal"/>
+      <w:lvlText w:val="%4."/>
+      <w:lvlJc w:val="left"/>
+      <w:pPr>
+        <w:ind w:left="2880" w:hanging="360"/>
+      </w:pPr>
+    </w:lvl>
+    <w:lvl w:ilvl="4" w:tplc="04150019" w:tentative="1">
+      <w:start w:val="1"/>
+      <w:numFmt w:val="lowerLetter"/>
+      <w:lvlText w:val="%5."/>
+      <w:lvlJc w:val="left"/>
+      <w:pPr>
+        <w:ind w:left="3600" w:hanging="360"/>
+      </w:pPr>
+    </w:lvl>
+    <w:lvl w:ilvl="5" w:tplc="0415001B" w:tentative="1">
+      <w:start w:val="1"/>
+      <w:numFmt w:val="lowerRoman"/>
+      <w:lvlText w:val="%6."/>
+      <w:lvlJc w:val="right"/>
+      <w:pPr>
+        <w:ind w:left="4320" w:hanging="180"/>
+      </w:pPr>
+    </w:lvl>
+    <w:lvl w:ilvl="6" w:tplc="0415000F" w:tentative="1">
+      <w:start w:val="1"/>
+      <w:numFmt w:val="decimal"/>
+      <w:lvlText w:val="%7."/>
+      <w:lvlJc w:val="left"/>
+      <w:pPr>
+        <w:ind w:left="5040" w:hanging="360"/>
+      </w:pPr>
+    </w:lvl>
+    <w:lvl w:ilvl="7" w:tplc="04150019" w:tentative="1">
+      <w:start w:val="1"/>
+      <w:numFmt w:val="lowerLetter"/>
+      <w:lvlText w:val="%8."/>
+      <w:lvlJc w:val="left"/>
+      <w:pPr>
+        <w:ind w:left="5760" w:hanging="360"/>
+      </w:pPr>
+    </w:lvl>
+    <w:lvl w:ilvl="8" w:tplc="0415001B" w:tentative="1">
+      <w:start w:val="1"/>
+      <w:numFmt w:val="lowerRoman"/>
+      <w:lvlText w:val="%9."/>
+      <w:lvlJc w:val="right"/>
+      <w:pPr>
+        <w:ind w:left="6480" w:hanging="180"/>
+      </w:pPr>
+    </w:lvl>
+  </w:abstractNum>
+  <w:abstractNum w:abstractNumId="2">
+    <w:nsid w:val="7511502B"/>
+    <w:multiLevelType w:val="hybridMultilevel"/>
+    <w:tmpl w:val="FB44E568"/>
+    <w:lvl w:ilvl="0" w:tplc="0415000F">
+      <w:start w:val="1"/>
+      <w:numFmt w:val="decimal"/>
+      <w:lvlText w:val="%1."/>
+      <w:lvlJc w:val="left"/>
+      <w:pPr>
+        <w:ind w:left="720" w:hanging="360"/>
+      </w:pPr>
+      <w:rPr>
+        <w:rFonts w:hint="default"/>
+      </w:rPr>
+    </w:lvl>
+    <w:lvl w:ilvl="1" w:tplc="04150019" w:tentative="1">
+      <w:start w:val="1"/>
+      <w:numFmt w:val="lowerLetter"/>
+      <w:lvlText w:val="%2."/>
+      <w:lvlJc w:val="left"/>
+      <w:pPr>
+        <w:ind w:left="1440" w:hanging="360"/>
+      </w:pPr>
+    </w:lvl>
+    <w:lvl w:ilvl="2" w:tplc="0415001B" w:tentative="1">
+      <w:start w:val="1"/>
+      <w:numFmt w:val="lowerRoman"/>
+      <w:lvlText w:val="%3."/>
+      <w:lvlJc w:val="right"/>
+      <w:pPr>
+        <w:ind w:left="2160" w:hanging="180"/>
+      </w:pPr>
+    </w:lvl>
+    <w:lvl w:ilvl="3" w:tplc="0415000F" w:tentative="1">
+      <w:start w:val="1"/>
+      <w:numFmt w:val="decimal"/>
+      <w:lvlText w:val="%4."/>
+      <w:lvlJc w:val="left"/>
+      <w:pPr>
+        <w:ind w:left="2880" w:hanging="360"/>
+      </w:pPr>
+    </w:lvl>
+    <w:lvl w:ilvl="4" w:tplc="04150019" w:tentative="1">
+      <w:start w:val="1"/>
+      <w:numFmt w:val="lowerLetter"/>
+      <w:lvlText w:val="%5."/>
+      <w:lvlJc w:val="left"/>
+      <w:pPr>
+        <w:ind w:left="3600" w:hanging="360"/>
+      </w:pPr>
+    </w:lvl>
+    <w:lvl w:ilvl="5" w:tplc="0415001B" w:tentative="1">
+      <w:start w:val="1"/>
+      <w:numFmt w:val="lowerRoman"/>
+      <w:lvlText w:val="%6."/>
+      <w:lvlJc w:val="right"/>
+      <w:pPr>
+        <w:ind w:left="4320" w:hanging="180"/>
+      </w:pPr>
+    </w:lvl>
+    <w:lvl w:ilvl="6" w:tplc="0415000F" w:tentative="1">
+      <w:start w:val="1"/>
+      <w:numFmt w:val="decimal"/>
+      <w:lvlText w:val="%7."/>
+      <w:lvlJc w:val="left"/>
+      <w:pPr>
+        <w:ind w:left="5040" w:hanging="360"/>
+      </w:pPr>
+    </w:lvl>
+    <w:lvl w:ilvl="7" w:tplc="04150019" w:tentative="1">
+      <w:start w:val="1"/>
+      <w:numFmt w:val="lowerLetter"/>
+      <w:lvlText w:val="%8."/>
+      <w:lvlJc w:val="left"/>
+      <w:pPr>
+        <w:ind w:left="5760" w:hanging="360"/>
+      </w:pPr>
+    </w:lvl>
+    <w:lvl w:ilvl="8" w:tplc="0415001B" w:tentative="1">
+      <w:start w:val="1"/>
+      <w:numFmt w:val="lowerRoman"/>
+      <w:lvlText w:val="%9."/>
+      <w:lvlJc w:val="right"/>
+      <w:pPr>
+        <w:ind w:left="6480" w:hanging="180"/>
+      </w:pPr>
+    </w:lvl>
+  </w:abstractNum>
+  <w:num w:numId="1">
+    <w:abstractNumId w:val="2"/>
+  </w:num>
+  <w:num w:numId="2">
+    <w:abstractNumId w:val="1"/>
+  </w:num>
+  <w:num w:numId="3">
+    <w:abstractNumId w:val="0"/>
+  </w:num>
+</w:numbering>
 </file>
 
 <file path=word/styles.xml><?xml version="1.0" encoding="utf-8"?>
@@ -181,6 +809,7 @@
   <w:style w:type="paragraph" w:default="1" w:styleId="Normalny">
     <w:name w:val="Normal"/>
     <w:qFormat/>
+    <w:rsid w:val="00FA6E48"/>
   </w:style>
   <w:style w:type="character" w:default="1" w:styleId="Domylnaczcionkaakapitu">
     <w:name w:val="Default Paragraph Font"/>
@@ -209,6 +838,17 @@
     <w:uiPriority w:val="99"/>
     <w:semiHidden/>
     <w:unhideWhenUsed/>
+  </w:style>
+  <w:style w:type="paragraph" w:styleId="Akapitzlist">
+    <w:name w:val="List Paragraph"/>
+    <w:basedOn w:val="Normalny"/>
+    <w:uiPriority w:val="34"/>
+    <w:qFormat/>
+    <w:rsid w:val="006B2613"/>
+    <w:pPr>
+      <w:ind w:left="720"/>
+      <w:contextualSpacing/>
+    </w:pPr>
   </w:style>
 </w:styles>
 </file>

</xml_diff>